<commit_message>
docs(hri): README, methodology.docx, presentation, assumptions register
- README: new "Harmonized Risk Indicator (HRI)" section under Risk Metric —
  formula (no multiplier), fail-soft optional columns, "—" repesca semantics,
  and the risk_indicator/optimum_hri selection guide with the scale warning
  and hri-mode guardrails.
- methodology.docx (via scripts/build_methodology_doc.py, regenerated):
  meta-table row + new section 5.4 covering HRI definition, aggregation,
  selectable optimisation target, model pair, and governance guardrails.
- generate_presentation.py: risk-metric slide now shows both formulas.
- reports/validation/assumptions_register.md: risk_indicator + optimum_hri
  registered as Core assumptions (units caveat, hri-mode restrictions);
  optimum_risk clarified as b2-units.

Co-Authored-By: Claude Fable 5 <noreply@anthropic.com>
Claude-Session: https://claude.ai/code/session_015LhKMLGSYEFjhy3snTVrNE
</commit_message>
<xml_diff>
--- a/methodology.docx
+++ b/methodology.docx
@@ -172,6 +172,31 @@
           <w:p>
             <w:r>
               <w:t>b2_ever_h6 — annualised, exposure-weighted 6-month vintage delinquency rate</w:t>
+            </w:r>
+          </w:p>
+        </w:tc>
+      </w:tr>
+      <w:tr>
+        <w:tc>
+          <w:tcPr>
+            <w:tcW w:type="dxa" w:w="4873"/>
+          </w:tcPr>
+          <w:p>
+            <w:r>
+              <w:rPr>
+                <w:b/>
+              </w:rPr>
+              <w:t>Harmonized Risk Indicator</w:t>
+            </w:r>
+          </w:p>
+        </w:tc>
+        <w:tc>
+          <w:tcPr>
+            <w:tcW w:type="dxa" w:w="4873"/>
+          </w:tcPr>
+          <w:p>
+            <w:r>
+              <w:t>hri_h6 = h_num_h6 / h_den_h6 (no multiplier) — reported beside b2 everywhere; selectable as the optimisation target via risk_indicator/optimum_hri</w:t>
             </w:r>
           </w:p>
         </w:tc>
@@ -2106,6 +2131,83 @@
           <w:i w:val="0"/>
         </w:rPr>
         <w:t>All flow indicators (todu_30ever_h6, todu_amt_pile_h6, oa_amt_h0) are scaled by annual_coef as part of grid aggregation — the per-bin sums are multiplied by annual_coef (identical to scaling each row first) — so risk and production are comparable across runs of different lengths and across segments observed over different windows.</w:t>
+      </w:r>
+    </w:p>
+    <w:p>
+      <w:pPr>
+        <w:pStyle w:val="Heading2"/>
+      </w:pPr>
+      <w:r>
+        <w:rPr>
+          <w:color w:val="143D6B"/>
+        </w:rPr>
+        <w:t>5.4 The Harmonized Risk Indicator (HRI)</w:t>
+      </w:r>
+    </w:p>
+    <w:p>
+      <w:pPr>
+        <w:spacing w:after="120"/>
+      </w:pPr>
+      <w:r>
+        <w:rPr>
+          <w:b w:val="0"/>
+          <w:i w:val="0"/>
+        </w:rPr>
+        <w:t>A second risk metric is computed and reported beside b2 across every surface (summary tables, segment and consolidated reports, backtest): the Harmonized Risk Indicator, a plain ratio with no annualisation multiplier:</w:t>
+      </w:r>
+    </w:p>
+    <w:p>
+      <w:pPr>
+        <w:spacing w:before="80" w:after="160"/>
+        <w:jc w:val="center"/>
+      </w:pPr>
+      <w:r>
+        <w:rPr>
+          <w:rFonts w:ascii="Consolas" w:hAnsi="Consolas"/>
+          <w:b/>
+          <w:color w:val="4A6FA5"/>
+          <w:sz w:val="22"/>
+        </w:rPr>
+        <w:t>hri_h6 = h_num_h6 / h_den_h6        (hri_h3 analogously)</w:t>
+      </w:r>
+    </w:p>
+    <w:p>
+      <w:pPr>
+        <w:pStyle w:val="ListBullet"/>
+        <w:spacing w:after="40"/>
+      </w:pPr>
+      <w:r>
+        <w:t>The h_* source columns are optional: extracts without them simply run without HRI (one warning, no other change).</w:t>
+      </w:r>
+    </w:p>
+    <w:p>
+      <w:pPr>
+        <w:pStyle w:val="ListBullet"/>
+        <w:spacing w:after="40"/>
+      </w:pPr>
+      <w:r>
+        <w:t>Aggregation is identical to b2: numerators and denominators are summed and the ratio is recomputed — rates are never averaged.</w:t>
+      </w:r>
+    </w:p>
+    <w:p>
+      <w:pPr>
+        <w:pStyle w:val="ListBullet"/>
+        <w:spacing w:after="40"/>
+      </w:pPr>
+      <w:r>
+        <w:t>Swap-in (repesca) HRI is shown as '—' unless HRI is the optimisation target: rejected applications carry no HRI outcomes, and no model invents them in display-only mode.</w:t>
+      </w:r>
+    </w:p>
+    <w:p>
+      <w:pPr>
+        <w:spacing w:after="120"/>
+      </w:pPr>
+      <w:r>
+        <w:rPr>
+          <w:b w:val="0"/>
+          <w:i w:val="0"/>
+        </w:rPr>
+        <w:t>The optimisation target is selectable: risk_indicator = 'b2_ever_h6' (default) or 'hri_h6'. In HRI mode the MILP risk budget, the efficient-frontier ordering and the scenario selection all run on hri_h6 against a dedicated target (optimum_hri, expressed in HRI-% units — a different scale from optimum_risk, which carries the x7 annualisation). A dedicated HRI model pair (rate + denominator) is trained to price rejected applications, and the reject-inference uplift and stress conservatism then apply to the HRI numerator exactly as they do to b2. Both indicators remain reported side by side regardless of which is targeted. Guardrails: the run fails loudly if the h_* columns are missing, pre-trained model reuse is refused, the out-of-time (MR) check keeps the frozen main-period cutoffs, and the b2-basis bootstrap confidence intervals are skipped with an explicit warning (HRI confidence intervals are a documented pending item). Switching the target indicator changes cutoffs and is governed like any material methodology change.</w:t>
       </w:r>
     </w:p>
     <w:p>

</xml_diff>

<commit_message>
docs(hri): README, methodology.docx, presentation, assumptions register (#228)
- README: new "Harmonized Risk Indicator (HRI)" section under Risk Metric —
  formula (no multiplier), fail-soft optional columns, "—" repesca semantics,
  and the risk_indicator/optimum_hri selection guide with the scale warning
  and hri-mode guardrails.
- methodology.docx (via scripts/build_methodology_doc.py, regenerated):
  meta-table row + new section 5.4 covering HRI definition, aggregation,
  selectable optimisation target, model pair, and governance guardrails.
- generate_presentation.py: risk-metric slide now shows both formulas.
- reports/validation/assumptions_register.md: risk_indicator + optimum_hri
  registered as Core assumptions (units caveat, hri-mode restrictions);
  optimum_risk clarified as b2-units.


Claude-Session: https://claude.ai/code/session_015LhKMLGSYEFjhy3snTVrNE

Co-authored-by: Claude Fable 5 <noreply@anthropic.com>
</commit_message>
<xml_diff>
--- a/methodology.docx
+++ b/methodology.docx
@@ -172,6 +172,31 @@
           <w:p>
             <w:r>
               <w:t>b2_ever_h6 — annualised, exposure-weighted 6-month vintage delinquency rate</w:t>
+            </w:r>
+          </w:p>
+        </w:tc>
+      </w:tr>
+      <w:tr>
+        <w:tc>
+          <w:tcPr>
+            <w:tcW w:type="dxa" w:w="4873"/>
+          </w:tcPr>
+          <w:p>
+            <w:r>
+              <w:rPr>
+                <w:b/>
+              </w:rPr>
+              <w:t>Harmonized Risk Indicator</w:t>
+            </w:r>
+          </w:p>
+        </w:tc>
+        <w:tc>
+          <w:tcPr>
+            <w:tcW w:type="dxa" w:w="4873"/>
+          </w:tcPr>
+          <w:p>
+            <w:r>
+              <w:t>hri_h6 = h_num_h6 / h_den_h6 (no multiplier) — reported beside b2 everywhere; selectable as the optimisation target via risk_indicator/optimum_hri</w:t>
             </w:r>
           </w:p>
         </w:tc>
@@ -2106,6 +2131,83 @@
           <w:i w:val="0"/>
         </w:rPr>
         <w:t>All flow indicators (todu_30ever_h6, todu_amt_pile_h6, oa_amt_h0) are scaled by annual_coef as part of grid aggregation — the per-bin sums are multiplied by annual_coef (identical to scaling each row first) — so risk and production are comparable across runs of different lengths and across segments observed over different windows.</w:t>
+      </w:r>
+    </w:p>
+    <w:p>
+      <w:pPr>
+        <w:pStyle w:val="Heading2"/>
+      </w:pPr>
+      <w:r>
+        <w:rPr>
+          <w:color w:val="143D6B"/>
+        </w:rPr>
+        <w:t>5.4 The Harmonized Risk Indicator (HRI)</w:t>
+      </w:r>
+    </w:p>
+    <w:p>
+      <w:pPr>
+        <w:spacing w:after="120"/>
+      </w:pPr>
+      <w:r>
+        <w:rPr>
+          <w:b w:val="0"/>
+          <w:i w:val="0"/>
+        </w:rPr>
+        <w:t>A second risk metric is computed and reported beside b2 across every surface (summary tables, segment and consolidated reports, backtest): the Harmonized Risk Indicator, a plain ratio with no annualisation multiplier:</w:t>
+      </w:r>
+    </w:p>
+    <w:p>
+      <w:pPr>
+        <w:spacing w:before="80" w:after="160"/>
+        <w:jc w:val="center"/>
+      </w:pPr>
+      <w:r>
+        <w:rPr>
+          <w:rFonts w:ascii="Consolas" w:hAnsi="Consolas"/>
+          <w:b/>
+          <w:color w:val="4A6FA5"/>
+          <w:sz w:val="22"/>
+        </w:rPr>
+        <w:t>hri_h6 = h_num_h6 / h_den_h6        (hri_h3 analogously)</w:t>
+      </w:r>
+    </w:p>
+    <w:p>
+      <w:pPr>
+        <w:pStyle w:val="ListBullet"/>
+        <w:spacing w:after="40"/>
+      </w:pPr>
+      <w:r>
+        <w:t>The h_* source columns are optional: extracts without them simply run without HRI (one warning, no other change).</w:t>
+      </w:r>
+    </w:p>
+    <w:p>
+      <w:pPr>
+        <w:pStyle w:val="ListBullet"/>
+        <w:spacing w:after="40"/>
+      </w:pPr>
+      <w:r>
+        <w:t>Aggregation is identical to b2: numerators and denominators are summed and the ratio is recomputed — rates are never averaged.</w:t>
+      </w:r>
+    </w:p>
+    <w:p>
+      <w:pPr>
+        <w:pStyle w:val="ListBullet"/>
+        <w:spacing w:after="40"/>
+      </w:pPr>
+      <w:r>
+        <w:t>Swap-in (repesca) HRI is shown as '—' unless HRI is the optimisation target: rejected applications carry no HRI outcomes, and no model invents them in display-only mode.</w:t>
+      </w:r>
+    </w:p>
+    <w:p>
+      <w:pPr>
+        <w:spacing w:after="120"/>
+      </w:pPr>
+      <w:r>
+        <w:rPr>
+          <w:b w:val="0"/>
+          <w:i w:val="0"/>
+        </w:rPr>
+        <w:t>The optimisation target is selectable: risk_indicator = 'b2_ever_h6' (default) or 'hri_h6'. In HRI mode the MILP risk budget, the efficient-frontier ordering and the scenario selection all run on hri_h6 against a dedicated target (optimum_hri, expressed in HRI-% units — a different scale from optimum_risk, which carries the x7 annualisation). A dedicated HRI model pair (rate + denominator) is trained to price rejected applications, and the reject-inference uplift and stress conservatism then apply to the HRI numerator exactly as they do to b2. Both indicators remain reported side by side regardless of which is targeted. Guardrails: the run fails loudly if the h_* columns are missing, pre-trained model reuse is refused, the out-of-time (MR) check keeps the frozen main-period cutoffs, and the b2-basis bootstrap confidence intervals are skipped with an explicit warning (HRI confidence intervals are a documented pending item). Switching the target indicator changes cutoffs and is governed like any material methodology change.</w:t>
       </w:r>
     </w:p>
     <w:p>

</xml_diff>